<commit_message>
Rà soát mẫu BVDLCN (đợt 1): thời hạn lưu ảnh CCCD, mục đích cần đồng ý, nơi nộp phiếu, thời hạn khi có bên xử lý
Co-Authored-By: Claude Opus 5.5 <noreply@anthropic.com>
Claude-Session: https://claude.ai/code/session_01EYfrLZFALxho7iwpK7bTVa
</commit_message>
<xml_diff>
--- a/templates/08-bo-mau-cap-1-2/10-thong-bao-xu-ly-dlcn-nguoi-lao-dong.docx
+++ b/templates/08-bo-mau-cap-1-2/10-thong-bao-xu-ly-dlcn-nguoi-lao-dong.docx
@@ -2667,7 +2667,7 @@
                 <w:sz w:val="24"/>
                 <w:szCs w:val="24"/>
               </w:rPr>
-              <w:t xml:space="preserve">Đăng ảnh, thông tin giới thiệu lên Intranet, website; lưu ảnh chụp thẻ căn cước</w:t>
+              <w:t xml:space="preserve">Đăng ảnh, thông tin giới thiệu lên Intranet, website; lưu ảnh chụp thẻ căn cước; lưu bản giấy khám sức khỏe (ngoài phần pháp luật buộc lưu)</w:t>
             </w:r>
           </w:p>
         </w:tc>
@@ -2704,7 +2704,7 @@
                 <w:sz w:val="24"/>
                 <w:szCs w:val="24"/>
               </w:rPr>
-              <w:t xml:space="preserve">Ảnh chân dung, ảnh thẻ căn cước</w:t>
+              <w:t xml:space="preserve">Ảnh chân dung, ảnh thẻ căn cước, giấy khám sức khỏe</w:t>
             </w:r>
           </w:p>
         </w:tc>
@@ -5472,7 +5472,7 @@
                 <w:sz w:val="24"/>
                 <w:szCs w:val="24"/>
               </w:rPr>
-              <w:t xml:space="preserve">Xóa ngay khi hoàn thành thủ tục bảo hiểm xã hội hoặc khi Anh/Chị rút lại đồng ý</w:t>
+              <w:t xml:space="preserve">Xóa khi hoàn thành thủ tục bảo hiểm xã hội (chậm nhất khi Anh/Chị nghỉ việc), hoặc sớm hơn khi Anh/Chị rút lại đồng ý (thời hạn tại mục 8)</w:t>
             </w:r>
           </w:p>
         </w:tc>
@@ -5780,7 +5780,7 @@
           <w:szCs w:val="26"/>
           <w:highlight w:val="yellow"/>
         </w:rPr>
-        <w:t xml:space="preserve">Phòng Hành chính – Nhân sự</w:t>
+        <w:t xml:space="preserve">Phòng Pháp chế (Tầng 4)</w:t>
       </w:r>
       <w:r>
         <w:rPr>
@@ -5860,7 +5860,7 @@
           <w:sz w:val="26"/>
           <w:szCs w:val="26"/>
         </w:rPr>
-        <w:t xml:space="preserve">. Thời hạn thực hiện: xem, chỉnh sửa, cung cấp dữ liệu: 10 ngày; rút lại đồng ý, hạn chế, phản đối xử lý: 15 ngày; xóa dữ liệu: 20 ngày. Yêu cầu phức tạp có thể gia hạn tối đa 01 lần; Công ty sẽ báo lý do (Điều 5 Nghị định số 356/2025/NĐ-CP).</w:t>
+        <w:t xml:space="preserve">. Thời hạn thực hiện: xem, chỉnh sửa, cung cấp dữ liệu: 10 ngày; rút lại đồng ý, hạn chế, phản đối xử lý: 15 ngày; xóa dữ liệu: 20 ngày. Nếu phải yêu cầu nhà cung cấp dịch vụ cùng thực hiện, thời hạn dài hơn (15, 20, 30 ngày tương ứng). Yêu cầu phức tạp có thể gia hạn tối đa 01 lần; Công ty sẽ báo lý do (Điều 5 Nghị định số 356/2025/NĐ-CP).</w:t>
       </w:r>
     </w:p>
     <w:p>
@@ -6250,7 +6250,7 @@
                 <w:szCs w:val="22"/>
                 <w:highlight w:val="yellow"/>
               </w:rPr>
-              <w:t xml:space="preserve">PC</w:t>
+              <w:t xml:space="preserve">PPC</w:t>
             </w:r>
             <w:r>
               <w:rPr>

</xml_diff>